<commit_message>
feat: close EvalCall model evaluation loop
</commit_message>
<xml_diff>
--- a/docs/EvalCall决赛提交清单-20260714.docx
+++ b/docs/EvalCall决赛提交清单-20260714.docx
@@ -8,7 +8,7 @@
       </w:pPr>
       <w:r>
         <w:rPr>
-          <w:rFonts w:ascii="Arial Unicode MS" w:hAnsi="Arial Unicode MS" w:eastAsia="Arial Unicode MS"/>
+          <w:rFonts w:ascii="PingFang SC" w:hAnsi="PingFang SC" w:eastAsia="PingFang SC"/>
           <w:b/>
           <w:color w:val="2E74B5"/>
           <w:sz w:val="18"/>
@@ -22,7 +22,7 @@
       </w:pPr>
       <w:r>
         <w:rPr>
-          <w:rFonts w:ascii="Arial Unicode MS" w:hAnsi="Arial Unicode MS" w:eastAsia="Arial Unicode MS"/>
+          <w:rFonts w:ascii="PingFang SC" w:hAnsi="PingFang SC" w:eastAsia="PingFang SC"/>
           <w:b/>
           <w:color w:val="142039"/>
           <w:sz w:val="50"/>
@@ -36,7 +36,7 @@
       </w:pPr>
       <w:r>
         <w:rPr>
-          <w:rFonts w:ascii="Arial Unicode MS" w:hAnsi="Arial Unicode MS" w:eastAsia="Arial Unicode MS"/>
+          <w:rFonts w:ascii="PingFang SC" w:hAnsi="PingFang SC" w:eastAsia="PingFang SC"/>
           <w:color w:val="687386"/>
           <w:sz w:val="24"/>
         </w:rPr>
@@ -82,7 +82,7 @@
             </w:pPr>
             <w:r>
               <w:rPr>
-                <w:rFonts w:ascii="Arial Unicode MS" w:hAnsi="Arial Unicode MS" w:eastAsia="Arial Unicode MS"/>
+                <w:rFonts w:ascii="PingFang SC" w:hAnsi="PingFang SC" w:eastAsia="PingFang SC"/>
                 <w:b/>
                 <w:color w:val="142039"/>
                 <w:sz w:val="19"/>
@@ -117,7 +117,7 @@
             </w:pPr>
             <w:r>
               <w:rPr>
-                <w:rFonts w:ascii="Arial Unicode MS" w:hAnsi="Arial Unicode MS" w:eastAsia="Arial Unicode MS"/>
+                <w:rFonts w:ascii="PingFang SC" w:hAnsi="PingFang SC" w:eastAsia="PingFang SC"/>
                 <w:b w:val="0"/>
                 <w:color w:val="142039"/>
                 <w:sz w:val="21"/>
@@ -139,7 +139,7 @@
       </w:pPr>
       <w:r>
         <w:rPr>
-          <w:rFonts w:ascii="Arial Unicode MS" w:hAnsi="Arial Unicode MS" w:eastAsia="Arial Unicode MS"/>
+          <w:rFonts w:ascii="PingFang SC" w:hAnsi="PingFang SC" w:eastAsia="PingFang SC"/>
           <w:color w:val="142039"/>
           <w:sz w:val="22"/>
         </w:rPr>
@@ -152,7 +152,7 @@
       </w:pPr>
       <w:r>
         <w:rPr>
-          <w:rFonts w:ascii="Arial Unicode MS" w:hAnsi="Arial Unicode MS" w:eastAsia="Arial Unicode MS"/>
+          <w:rFonts w:ascii="PingFang SC" w:hAnsi="PingFang SC" w:eastAsia="PingFang SC"/>
           <w:color w:val="2E74B5"/>
           <w:sz w:val="26"/>
         </w:rPr>
@@ -166,7 +166,7 @@
       </w:pPr>
       <w:r>
         <w:rPr>
-          <w:rFonts w:ascii="Arial Unicode MS" w:hAnsi="Arial Unicode MS" w:eastAsia="Arial Unicode MS"/>
+          <w:rFonts w:ascii="PingFang SC" w:hAnsi="PingFang SC" w:eastAsia="PingFang SC"/>
           <w:color w:val="142039"/>
           <w:sz w:val="22"/>
         </w:rPr>
@@ -174,11 +174,11 @@
       </w:r>
       <w:r>
         <w:rPr>
-          <w:rFonts w:ascii="Menlo" w:hAnsi="Menlo" w:eastAsia="Arial Unicode MS"/>
+          <w:rFonts w:ascii="Menlo" w:hAnsi="Menlo" w:eastAsia="PingFang SC"/>
           <w:color w:val="1F4D78"/>
           <w:sz w:val="21"/>
         </w:rPr>
-        <w:t>EvalCall答辩稿-10分钟路演最终版-20260714.pptx</w:t>
+        <w:t>EvalCall答辩稿-评审高分终版-20260714.pptx</w:t>
       </w:r>
     </w:p>
     <w:p>
@@ -188,7 +188,7 @@
       </w:pPr>
       <w:r>
         <w:rPr>
-          <w:rFonts w:ascii="Arial Unicode MS" w:hAnsi="Arial Unicode MS" w:eastAsia="Arial Unicode MS"/>
+          <w:rFonts w:ascii="PingFang SC" w:hAnsi="PingFang SC" w:eastAsia="PingFang SC"/>
           <w:color w:val="142039"/>
           <w:sz w:val="22"/>
         </w:rPr>
@@ -196,7 +196,7 @@
       </w:r>
       <w:r>
         <w:rPr>
-          <w:rFonts w:ascii="Menlo" w:hAnsi="Menlo" w:eastAsia="Arial Unicode MS"/>
+          <w:rFonts w:ascii="Menlo" w:hAnsi="Menlo" w:eastAsia="PingFang SC"/>
           <w:color w:val="1F4D78"/>
           <w:sz w:val="21"/>
         </w:rPr>
@@ -204,7 +204,7 @@
       </w:r>
       <w:r>
         <w:rPr>
-          <w:rFonts w:ascii="Arial Unicode MS" w:hAnsi="Arial Unicode MS" w:eastAsia="Arial Unicode MS"/>
+          <w:rFonts w:ascii="PingFang SC" w:hAnsi="PingFang SC" w:eastAsia="PingFang SC"/>
           <w:color w:val="142039"/>
           <w:sz w:val="22"/>
         </w:rPr>
@@ -218,7 +218,7 @@
       </w:pPr>
       <w:r>
         <w:rPr>
-          <w:rFonts w:ascii="Arial Unicode MS" w:hAnsi="Arial Unicode MS" w:eastAsia="Arial Unicode MS"/>
+          <w:rFonts w:ascii="PingFang SC" w:hAnsi="PingFang SC" w:eastAsia="PingFang SC"/>
           <w:color w:val="142039"/>
           <w:sz w:val="22"/>
         </w:rPr>
@@ -226,7 +226,7 @@
       </w:r>
       <w:r>
         <w:rPr>
-          <w:rFonts w:ascii="Menlo" w:hAnsi="Menlo" w:eastAsia="Arial Unicode MS"/>
+          <w:rFonts w:ascii="Menlo" w:hAnsi="Menlo" w:eastAsia="PingFang SC"/>
           <w:color w:val="1F4D78"/>
           <w:sz w:val="21"/>
         </w:rPr>
@@ -240,7 +240,7 @@
       </w:pPr>
       <w:r>
         <w:rPr>
-          <w:rFonts w:ascii="Arial Unicode MS" w:hAnsi="Arial Unicode MS" w:eastAsia="Arial Unicode MS"/>
+          <w:rFonts w:ascii="PingFang SC" w:hAnsi="PingFang SC" w:eastAsia="PingFang SC"/>
           <w:color w:val="142039"/>
           <w:sz w:val="22"/>
         </w:rPr>
@@ -248,7 +248,7 @@
       </w:r>
       <w:r>
         <w:rPr>
-          <w:rFonts w:ascii="Menlo" w:hAnsi="Menlo" w:eastAsia="Arial Unicode MS"/>
+          <w:rFonts w:ascii="Menlo" w:hAnsi="Menlo" w:eastAsia="PingFang SC"/>
           <w:color w:val="1F4D78"/>
           <w:sz w:val="21"/>
         </w:rPr>
@@ -256,7 +256,7 @@
       </w:r>
       <w:r>
         <w:rPr>
-          <w:rFonts w:ascii="Arial Unicode MS" w:hAnsi="Arial Unicode MS" w:eastAsia="Arial Unicode MS"/>
+          <w:rFonts w:ascii="PingFang SC" w:hAnsi="PingFang SC" w:eastAsia="PingFang SC"/>
           <w:color w:val="142039"/>
           <w:sz w:val="22"/>
         </w:rPr>
@@ -270,7 +270,7 @@
       </w:pPr>
       <w:r>
         <w:rPr>
-          <w:rFonts w:ascii="Arial Unicode MS" w:hAnsi="Arial Unicode MS" w:eastAsia="Arial Unicode MS"/>
+          <w:rFonts w:ascii="PingFang SC" w:hAnsi="PingFang SC" w:eastAsia="PingFang SC"/>
           <w:color w:val="142039"/>
           <w:sz w:val="22"/>
         </w:rPr>
@@ -278,7 +278,7 @@
       </w:r>
       <w:r>
         <w:rPr>
-          <w:rFonts w:ascii="Menlo" w:hAnsi="Menlo" w:eastAsia="Arial Unicode MS"/>
+          <w:rFonts w:ascii="Menlo" w:hAnsi="Menlo" w:eastAsia="PingFang SC"/>
           <w:color w:val="1F4D78"/>
           <w:sz w:val="21"/>
         </w:rPr>
@@ -291,7 +291,7 @@
       </w:pPr>
       <w:r>
         <w:rPr>
-          <w:rFonts w:ascii="Arial Unicode MS" w:hAnsi="Arial Unicode MS" w:eastAsia="Arial Unicode MS"/>
+          <w:rFonts w:ascii="PingFang SC" w:hAnsi="PingFang SC" w:eastAsia="PingFang SC"/>
           <w:color w:val="2E74B5"/>
           <w:sz w:val="26"/>
         </w:rPr>
@@ -305,7 +305,7 @@
       </w:pPr>
       <w:r>
         <w:rPr>
-          <w:rFonts w:ascii="Arial Unicode MS" w:hAnsi="Arial Unicode MS" w:eastAsia="Arial Unicode MS"/>
+          <w:rFonts w:ascii="PingFang SC" w:hAnsi="PingFang SC" w:eastAsia="PingFang SC"/>
           <w:color w:val="142039"/>
           <w:sz w:val="22"/>
         </w:rPr>
@@ -319,7 +319,7 @@
       </w:pPr>
       <w:r>
         <w:rPr>
-          <w:rFonts w:ascii="Arial Unicode MS" w:hAnsi="Arial Unicode MS" w:eastAsia="Arial Unicode MS"/>
+          <w:rFonts w:ascii="PingFang SC" w:hAnsi="PingFang SC" w:eastAsia="PingFang SC"/>
           <w:color w:val="142039"/>
           <w:sz w:val="22"/>
         </w:rPr>
@@ -333,7 +333,7 @@
       </w:pPr>
       <w:r>
         <w:rPr>
-          <w:rFonts w:ascii="Arial Unicode MS" w:hAnsi="Arial Unicode MS" w:eastAsia="Arial Unicode MS"/>
+          <w:rFonts w:ascii="PingFang SC" w:hAnsi="PingFang SC" w:eastAsia="PingFang SC"/>
           <w:color w:val="142039"/>
           <w:sz w:val="22"/>
         </w:rPr>
@@ -347,7 +347,7 @@
       </w:pPr>
       <w:r>
         <w:rPr>
-          <w:rFonts w:ascii="Arial Unicode MS" w:hAnsi="Arial Unicode MS" w:eastAsia="Arial Unicode MS"/>
+          <w:rFonts w:ascii="PingFang SC" w:hAnsi="PingFang SC" w:eastAsia="PingFang SC"/>
           <w:color w:val="142039"/>
           <w:sz w:val="22"/>
         </w:rPr>
@@ -355,7 +355,7 @@
       </w:r>
       <w:r>
         <w:rPr>
-          <w:rFonts w:ascii="Menlo" w:hAnsi="Menlo" w:eastAsia="Arial Unicode MS"/>
+          <w:rFonts w:ascii="Menlo" w:hAnsi="Menlo" w:eastAsia="PingFang SC"/>
           <w:color w:val="1F4D78"/>
           <w:sz w:val="21"/>
         </w:rPr>
@@ -369,7 +369,7 @@
       </w:pPr>
       <w:r>
         <w:rPr>
-          <w:rFonts w:ascii="Arial Unicode MS" w:hAnsi="Arial Unicode MS" w:eastAsia="Arial Unicode MS"/>
+          <w:rFonts w:ascii="PingFang SC" w:hAnsi="PingFang SC" w:eastAsia="PingFang SC"/>
           <w:color w:val="142039"/>
           <w:sz w:val="22"/>
         </w:rPr>
@@ -383,7 +383,7 @@
       </w:pPr>
       <w:r>
         <w:rPr>
-          <w:rFonts w:ascii="Arial Unicode MS" w:hAnsi="Arial Unicode MS" w:eastAsia="Arial Unicode MS"/>
+          <w:rFonts w:ascii="PingFang SC" w:hAnsi="PingFang SC" w:eastAsia="PingFang SC"/>
           <w:color w:val="142039"/>
           <w:sz w:val="22"/>
         </w:rPr>
@@ -397,7 +397,7 @@
       </w:pPr>
       <w:r>
         <w:rPr>
-          <w:rFonts w:ascii="Arial Unicode MS" w:hAnsi="Arial Unicode MS" w:eastAsia="Arial Unicode MS"/>
+          <w:rFonts w:ascii="PingFang SC" w:hAnsi="PingFang SC" w:eastAsia="PingFang SC"/>
           <w:color w:val="142039"/>
           <w:sz w:val="22"/>
         </w:rPr>
@@ -411,7 +411,7 @@
       </w:pPr>
       <w:r>
         <w:rPr>
-          <w:rFonts w:ascii="Arial Unicode MS" w:hAnsi="Arial Unicode MS" w:eastAsia="Arial Unicode MS"/>
+          <w:rFonts w:ascii="PingFang SC" w:hAnsi="PingFang SC" w:eastAsia="PingFang SC"/>
           <w:color w:val="142039"/>
           <w:sz w:val="22"/>
         </w:rPr>
@@ -424,7 +424,7 @@
       </w:pPr>
       <w:r>
         <w:rPr>
-          <w:rFonts w:ascii="Arial Unicode MS" w:hAnsi="Arial Unicode MS" w:eastAsia="Arial Unicode MS"/>
+          <w:rFonts w:ascii="PingFang SC" w:hAnsi="PingFang SC" w:eastAsia="PingFang SC"/>
           <w:color w:val="2E74B5"/>
           <w:sz w:val="26"/>
         </w:rPr>
@@ -442,7 +442,7 @@
       </w:pPr>
       <w:r>
         <w:rPr>
-          <w:rFonts w:ascii="Arial Unicode MS" w:hAnsi="Arial Unicode MS" w:eastAsia="Arial Unicode MS"/>
+          <w:rFonts w:ascii="PingFang SC" w:hAnsi="PingFang SC" w:eastAsia="PingFang SC"/>
           <w:color w:val="142039"/>
           <w:sz w:val="22"/>
         </w:rPr>
@@ -460,7 +460,7 @@
       </w:pPr>
       <w:r>
         <w:rPr>
-          <w:rFonts w:ascii="Arial Unicode MS" w:hAnsi="Arial Unicode MS" w:eastAsia="Arial Unicode MS"/>
+          <w:rFonts w:ascii="PingFang SC" w:hAnsi="PingFang SC" w:eastAsia="PingFang SC"/>
           <w:color w:val="142039"/>
           <w:sz w:val="22"/>
         </w:rPr>
@@ -478,7 +478,7 @@
       </w:pPr>
       <w:r>
         <w:rPr>
-          <w:rFonts w:ascii="Arial Unicode MS" w:hAnsi="Arial Unicode MS" w:eastAsia="Arial Unicode MS"/>
+          <w:rFonts w:ascii="PingFang SC" w:hAnsi="PingFang SC" w:eastAsia="PingFang SC"/>
           <w:color w:val="142039"/>
           <w:sz w:val="22"/>
         </w:rPr>
@@ -491,7 +491,7 @@
       </w:pPr>
       <w:r>
         <w:rPr>
-          <w:rFonts w:ascii="Arial Unicode MS" w:hAnsi="Arial Unicode MS" w:eastAsia="Arial Unicode MS"/>
+          <w:rFonts w:ascii="PingFang SC" w:hAnsi="PingFang SC" w:eastAsia="PingFang SC"/>
           <w:color w:val="2E74B5"/>
           <w:sz w:val="26"/>
         </w:rPr>
@@ -505,11 +505,11 @@
       </w:pPr>
       <w:r>
         <w:rPr>
-          <w:rFonts w:ascii="Arial Unicode MS" w:hAnsi="Arial Unicode MS" w:eastAsia="Arial Unicode MS"/>
+          <w:rFonts w:ascii="PingFang SC" w:hAnsi="PingFang SC" w:eastAsia="PingFang SC"/>
           <w:color w:val="142039"/>
           <w:sz w:val="22"/>
         </w:rPr>
-        <w:t>配送改约：10 通、83 项、830 条判断、10/10 打回、履约 10%、P0 10/10。</w:t>
+        <w:t>配送改约 v1：10 通、21 项、210 条判断、3/10 打回、履约 40%、P0 3/10、平均分 62.5。</w:t>
       </w:r>
     </w:p>
     <w:p>
@@ -519,11 +519,11 @@
       </w:pPr>
       <w:r>
         <w:rPr>
-          <w:rFonts w:ascii="Arial Unicode MS" w:hAnsi="Arial Unicode MS" w:eastAsia="Arial Unicode MS"/>
+          <w:rFonts w:ascii="PingFang SC" w:hAnsi="PingFang SC" w:eastAsia="PingFang SC"/>
           <w:color w:val="142039"/>
           <w:sz w:val="22"/>
         </w:rPr>
-        <w:t>配送改约首要根因：外呼模型，中置信；NA 40%，2 项规则冲突需复核。</w:t>
+        <w:t>配送改约首要根因：外呼模型，中置信；NA 9%，裁判分歧 0%，模型归因分 48。</w:t>
       </w:r>
     </w:p>
     <w:p>
@@ -533,7 +533,67 @@
       </w:pPr>
       <w:r>
         <w:rPr>
-          <w:rFonts w:ascii="Arial Unicode MS" w:hAnsi="Arial Unicode MS" w:eastAsia="Arial Unicode MS"/>
+          <w:rFonts w:ascii="PingFang SC" w:hAnsi="PingFang SC" w:eastAsia="PingFang SC"/>
+          <w:color w:val="142039"/>
+          <w:sz w:val="22"/>
+        </w:rPr>
+        <w:t>配送改约 v2：门禁“可上线”、P0 0/10、履约 40%、平均分 91.4；同一用户输入、SOP、Checklist、Judge 正常重评，不手改 judgments。</w:t>
+      </w:r>
+    </w:p>
+    <w:p>
+      <w:pPr>
+        <w:pStyle w:val="ListBullet"/>
+        <w:spacing w:after="80" w:line="300" w:lineRule="auto"/>
+      </w:pPr>
+      <w:r>
+        <w:rPr>
+          <w:rFonts w:ascii="PingFang SC" w:hAnsi="PingFang SC" w:eastAsia="PingFang SC"/>
+          <w:color w:val="142039"/>
+          <w:sz w:val="22"/>
+        </w:rPr>
+        <w:t xml:space="preserve">原生 diff：6 项改善、1 项 style 退化待复测；证据见 </w:t>
+      </w:r>
+      <w:r>
+        <w:rPr>
+          <w:rFonts w:ascii="Menlo" w:hAnsi="Menlo" w:eastAsia="PingFang SC"/>
+          <w:color w:val="1F4D78"/>
+          <w:sz w:val="21"/>
+        </w:rPr>
+        <w:t>runs/t02_delivery_fixedusers_regression_20260714/comparison.json</w:t>
+      </w:r>
+      <w:r>
+        <w:rPr>
+          <w:rFonts w:ascii="PingFang SC" w:hAnsi="PingFang SC" w:eastAsia="PingFang SC"/>
+          <w:color w:val="142039"/>
+          <w:sz w:val="22"/>
+        </w:rPr>
+        <w:t xml:space="preserve"> 与 </w:t>
+      </w:r>
+      <w:r>
+        <w:rPr>
+          <w:rFonts w:ascii="Menlo" w:hAnsi="Menlo" w:eastAsia="PingFang SC"/>
+          <w:color w:val="1F4D78"/>
+          <w:sz w:val="21"/>
+        </w:rPr>
+        <w:t>native_diff.json</w:t>
+      </w:r>
+      <w:r>
+        <w:rPr>
+          <w:rFonts w:ascii="PingFang SC" w:hAnsi="PingFang SC" w:eastAsia="PingFang SC"/>
+          <w:color w:val="142039"/>
+          <w:sz w:val="22"/>
+        </w:rPr>
+        <w:t>。</w:t>
+      </w:r>
+    </w:p>
+    <w:p>
+      <w:pPr>
+        <w:pStyle w:val="ListBullet"/>
+        <w:spacing w:after="80" w:line="300" w:lineRule="auto"/>
+      </w:pPr>
+      <w:r>
+        <w:rPr>
+          <w:rFonts w:ascii="PingFang SC" w:hAnsi="PingFang SC" w:eastAsia="PingFang SC"/>
           <w:color w:val="142039"/>
           <w:sz w:val="22"/>
         </w:rPr>
@@ -547,7 +607,7 @@
       </w:pPr>
       <w:r>
         <w:rPr>
-          <w:rFonts w:ascii="Arial Unicode MS" w:hAnsi="Arial Unicode MS" w:eastAsia="Arial Unicode MS"/>
+          <w:rFonts w:ascii="PingFang SC" w:hAnsi="PingFang SC" w:eastAsia="PingFang SC"/>
           <w:color w:val="142039"/>
           <w:sz w:val="22"/>
         </w:rPr>
@@ -560,7 +620,7 @@
       </w:pPr>
       <w:r>
         <w:rPr>
-          <w:rFonts w:ascii="Arial Unicode MS" w:hAnsi="Arial Unicode MS" w:eastAsia="Arial Unicode MS"/>
+          <w:rFonts w:ascii="PingFang SC" w:hAnsi="PingFang SC" w:eastAsia="PingFang SC"/>
           <w:color w:val="2E74B5"/>
           <w:sz w:val="26"/>
         </w:rPr>
@@ -574,7 +634,7 @@
       </w:pPr>
       <w:r>
         <w:rPr>
-          <w:rFonts w:ascii="Arial Unicode MS" w:hAnsi="Arial Unicode MS" w:eastAsia="Arial Unicode MS"/>
+          <w:rFonts w:ascii="PingFang SC" w:hAnsi="PingFang SC" w:eastAsia="PingFang SC"/>
           <w:color w:val="142039"/>
           <w:sz w:val="22"/>
         </w:rPr>
@@ -588,7 +648,7 @@
       </w:pPr>
       <w:r>
         <w:rPr>
-          <w:rFonts w:ascii="Arial Unicode MS" w:hAnsi="Arial Unicode MS" w:eastAsia="Arial Unicode MS"/>
+          <w:rFonts w:ascii="PingFang SC" w:hAnsi="PingFang SC" w:eastAsia="PingFang SC"/>
           <w:color w:val="142039"/>
           <w:sz w:val="22"/>
         </w:rPr>
@@ -602,7 +662,7 @@
       </w:pPr>
       <w:r>
         <w:rPr>
-          <w:rFonts w:ascii="Arial Unicode MS" w:hAnsi="Arial Unicode MS" w:eastAsia="Arial Unicode MS"/>
+          <w:rFonts w:ascii="PingFang SC" w:hAnsi="PingFang SC" w:eastAsia="PingFang SC"/>
           <w:color w:val="142039"/>
           <w:sz w:val="22"/>
         </w:rPr>
@@ -616,7 +676,7 @@
       </w:pPr>
       <w:r>
         <w:rPr>
-          <w:rFonts w:ascii="Arial Unicode MS" w:hAnsi="Arial Unicode MS" w:eastAsia="Arial Unicode MS"/>
+          <w:rFonts w:ascii="PingFang SC" w:hAnsi="PingFang SC" w:eastAsia="PingFang SC"/>
           <w:color w:val="142039"/>
           <w:sz w:val="22"/>
         </w:rPr>
@@ -630,7 +690,7 @@
       </w:pPr>
       <w:r>
         <w:rPr>
-          <w:rFonts w:ascii="Arial Unicode MS" w:hAnsi="Arial Unicode MS" w:eastAsia="Arial Unicode MS"/>
+          <w:rFonts w:ascii="PingFang SC" w:hAnsi="PingFang SC" w:eastAsia="PingFang SC"/>
           <w:color w:val="142039"/>
           <w:sz w:val="22"/>
         </w:rPr>
@@ -643,7 +703,7 @@
       </w:pPr>
       <w:r>
         <w:rPr>
-          <w:rFonts w:ascii="Arial Unicode MS" w:hAnsi="Arial Unicode MS" w:eastAsia="Arial Unicode MS"/>
+          <w:rFonts w:ascii="PingFang SC" w:hAnsi="PingFang SC" w:eastAsia="PingFang SC"/>
           <w:color w:val="2E74B5"/>
           <w:sz w:val="26"/>
         </w:rPr>
@@ -657,7 +717,7 @@
       </w:pPr>
       <w:r>
         <w:rPr>
-          <w:rFonts w:ascii="Arial Unicode MS" w:hAnsi="Arial Unicode MS" w:eastAsia="Arial Unicode MS"/>
+          <w:rFonts w:ascii="PingFang SC" w:hAnsi="PingFang SC" w:eastAsia="PingFang SC"/>
           <w:color w:val="142039"/>
           <w:sz w:val="22"/>
         </w:rPr>
@@ -671,7 +731,7 @@
       </w:pPr>
       <w:r>
         <w:rPr>
-          <w:rFonts w:ascii="Arial Unicode MS" w:hAnsi="Arial Unicode MS" w:eastAsia="Arial Unicode MS"/>
+          <w:rFonts w:ascii="PingFang SC" w:hAnsi="PingFang SC" w:eastAsia="PingFang SC"/>
           <w:color w:val="142039"/>
           <w:sz w:val="22"/>
         </w:rPr>
@@ -685,7 +745,7 @@
       </w:pPr>
       <w:r>
         <w:rPr>
-          <w:rFonts w:ascii="Arial Unicode MS" w:hAnsi="Arial Unicode MS" w:eastAsia="Arial Unicode MS"/>
+          <w:rFonts w:ascii="PingFang SC" w:hAnsi="PingFang SC" w:eastAsia="PingFang SC"/>
           <w:color w:val="142039"/>
           <w:sz w:val="22"/>
         </w:rPr>
@@ -713,7 +773,7 @@
     </w:pPr>
     <w:r>
       <w:rPr>
-        <w:rFonts w:ascii="Arial Unicode MS" w:hAnsi="Arial Unicode MS" w:eastAsia="Arial Unicode MS"/>
+        <w:rFonts w:ascii="PingFang SC" w:hAnsi="PingFang SC" w:eastAsia="PingFang SC"/>
         <w:color w:val="687386"/>
         <w:sz w:val="17"/>
       </w:rPr>
@@ -733,7 +793,7 @@
     </w:pPr>
     <w:r>
       <w:rPr>
-        <w:rFonts w:ascii="Arial Unicode MS" w:hAnsi="Arial Unicode MS" w:eastAsia="Arial Unicode MS"/>
+        <w:rFonts w:ascii="PingFang SC" w:hAnsi="PingFang SC" w:eastAsia="PingFang SC"/>
         <w:b/>
         <w:color w:val="687386"/>
         <w:sz w:val="17"/>
@@ -1129,7 +1189,7 @@
       <w:spacing w:after="120" w:line="300" w:lineRule="auto"/>
     </w:pPr>
     <w:rPr>
-      <w:rFonts w:ascii="Arial Unicode MS" w:hAnsi="Arial Unicode MS" w:eastAsia="Arial Unicode MS"/>
+      <w:rFonts w:ascii="PingFang SC" w:hAnsi="PingFang SC" w:eastAsia="PingFang SC"/>
       <w:color w:val="142039"/>
       <w:sz w:val="22"/>
     </w:rPr>
@@ -1193,7 +1253,7 @@
       <w:outlineLvl w:val="0"/>
     </w:pPr>
     <w:rPr>
-      <w:rFonts w:asciiTheme="majorHAnsi" w:eastAsiaTheme="majorEastAsia" w:hAnsiTheme="majorHAnsi" w:cstheme="majorBidi" w:ascii="Arial Unicode MS" w:hAnsi="Arial Unicode MS" w:eastAsia="Arial Unicode MS"/>
+      <w:rFonts w:asciiTheme="majorHAnsi" w:eastAsiaTheme="majorEastAsia" w:hAnsiTheme="majorHAnsi" w:cstheme="majorBidi" w:ascii="PingFang SC" w:hAnsi="PingFang SC" w:eastAsia="PingFang SC"/>
       <w:b/>
       <w:bCs/>
       <w:color w:val="2E74B5"/>
@@ -1217,7 +1277,7 @@
       <w:outlineLvl w:val="1"/>
     </w:pPr>
     <w:rPr>
-      <w:rFonts w:asciiTheme="majorHAnsi" w:eastAsiaTheme="majorEastAsia" w:hAnsiTheme="majorHAnsi" w:cstheme="majorBidi" w:ascii="Arial Unicode MS" w:hAnsi="Arial Unicode MS" w:eastAsia="Arial Unicode MS"/>
+      <w:rFonts w:asciiTheme="majorHAnsi" w:eastAsiaTheme="majorEastAsia" w:hAnsiTheme="majorHAnsi" w:cstheme="majorBidi" w:ascii="PingFang SC" w:hAnsi="PingFang SC" w:eastAsia="PingFang SC"/>
       <w:b/>
       <w:bCs/>
       <w:color w:val="2E74B5"/>
@@ -1241,7 +1301,7 @@
       <w:outlineLvl w:val="2"/>
     </w:pPr>
     <w:rPr>
-      <w:rFonts w:asciiTheme="majorHAnsi" w:eastAsiaTheme="majorEastAsia" w:hAnsiTheme="majorHAnsi" w:cstheme="majorBidi" w:ascii="Arial Unicode MS" w:hAnsi="Arial Unicode MS" w:eastAsia="Arial Unicode MS"/>
+      <w:rFonts w:asciiTheme="majorHAnsi" w:eastAsiaTheme="majorEastAsia" w:hAnsiTheme="majorHAnsi" w:cstheme="majorBidi" w:ascii="PingFang SC" w:hAnsi="PingFang SC" w:eastAsia="PingFang SC"/>
       <w:b/>
       <w:bCs/>
       <w:color w:val="1F4D78"/>
@@ -1666,7 +1726,7 @@
       <w:contextualSpacing/>
     </w:pPr>
     <w:rPr>
-      <w:rFonts w:ascii="Arial Unicode MS" w:hAnsi="Arial Unicode MS" w:eastAsia="Arial Unicode MS"/>
+      <w:rFonts w:ascii="PingFang SC" w:hAnsi="PingFang SC" w:eastAsia="PingFang SC"/>
       <w:color w:val="142039"/>
       <w:sz w:val="22"/>
     </w:rPr>
@@ -1712,7 +1772,7 @@
       <w:contextualSpacing/>
     </w:pPr>
     <w:rPr>
-      <w:rFonts w:ascii="Arial Unicode MS" w:hAnsi="Arial Unicode MS" w:eastAsia="Arial Unicode MS"/>
+      <w:rFonts w:ascii="PingFang SC" w:hAnsi="PingFang SC" w:eastAsia="PingFang SC"/>
       <w:color w:val="142039"/>
       <w:sz w:val="22"/>
     </w:rPr>

</xml_diff>